<commit_message>
Contratos marco v4: titularidad de las proveedoras, renovación automática, pago miércoles o jueves, anexo de inscripción tributaria; sin páginas en blanco
Co-Authored-By: Claude Opus 5.5 <noreply@anthropic.com>
Claude-Session: https://claude.ai/code/session_01V7BfzBTA8TEWMK1apGBBKC
</commit_message>
<xml_diff>
--- a/casos/laboral-kcarmona/documentos/2026-10-27_Control_interno_compras_contratos_marco.docx
+++ b/casos/laboral-kcarmona/documentos/2026-10-27_Control_interno_compras_contratos_marco.docx
@@ -136,7 +136,7 @@
           <w:color w:val="2F2E47"/>
           <w:sz w:val="21"/>
         </w:rPr>
-        <w:t>Las comunicaciones sobre el producto van por el correo o la carpeta designados en la orden, no por los grupos de trabajo.</w:t>
+        <w:t>Las comunicaciones de la compra se hacen en el canal de la orden, porque forman parte de una relación comercial.</w:t>
       </w:r>
     </w:p>
     <w:p>
@@ -151,7 +151,7 @@
           <w:color w:val="2F2E47"/>
           <w:sz w:val="21"/>
         </w:rPr>
-        <w:t>No se dan instrucciones de ejecución ni se asignan plazos fuera de los pactados en la orden.</w:t>
+        <w:t>No se dan instrucciones de ejecución ni se fijan plazos fuera de los pactados en la orden.</w:t>
       </w:r>
     </w:p>
     <w:p>
@@ -167,6 +167,111 @@
           <w:sz w:val="21"/>
         </w:rPr>
         <w:t>La elaboración ocurre fuera de la jornada laboral. Si se graba en la clínica, el horario queda en la orden.</w:t>
+      </w:r>
+    </w:p>
+    <w:p>
+      <w:pPr>
+        <w:keepNext/>
+        <w:spacing w:before="280" w:after="120" w:line="300" w:lineRule="auto"/>
+        <w:pBdr>
+          <w:bottom w:val="single" w:sz="6" w:space="4" w:color="D1D0CB"/>
+        </w:pBdr>
+      </w:pPr>
+      <w:r>
+        <w:rPr>
+          <w:rFonts w:ascii="Safira March" w:hAnsi="Safira March"/>
+          <w:color w:val="131237"/>
+          <w:sz w:val="28"/>
+        </w:rPr>
+        <w:t>Cuatro hechos que se anotan</w:t>
+      </w:r>
+    </w:p>
+    <w:p>
+      <w:pPr>
+        <w:spacing w:before="0" w:after="120" w:line="300" w:lineRule="auto"/>
+      </w:pPr>
+      <w:r>
+        <w:rPr>
+          <w:rFonts w:ascii="Georgia" w:hAnsi="Georgia"/>
+          <w:b w:val="0"/>
+          <w:color w:val="2F2E47"/>
+          <w:sz w:val="21"/>
+        </w:rPr>
+        <w:t>En cada expediente se anota, con lo que se sabe en ese momento:</w:t>
+      </w:r>
+    </w:p>
+    <w:p>
+      <w:pPr>
+        <w:pStyle w:val="ListNumber"/>
+        <w:spacing w:before="0" w:after="60" w:line="300" w:lineRule="auto"/>
+      </w:pPr>
+      <w:r>
+        <w:rPr>
+          <w:rFonts w:ascii="Georgia" w:hAnsi="Georgia"/>
+          <w:b w:val="0"/>
+          <w:color w:val="2F2E47"/>
+          <w:sz w:val="21"/>
+        </w:rPr>
+        <w:t>Si el producto se elaboró fuera de la jornada laboral.</w:t>
+      </w:r>
+    </w:p>
+    <w:p>
+      <w:pPr>
+        <w:pStyle w:val="ListNumber"/>
+        <w:spacing w:before="0" w:after="60" w:line="300" w:lineRule="auto"/>
+      </w:pPr>
+      <w:r>
+        <w:rPr>
+          <w:rFonts w:ascii="Georgia" w:hAnsi="Georgia"/>
+          <w:b w:val="0"/>
+          <w:color w:val="2F2E47"/>
+          <w:sz w:val="21"/>
+        </w:rPr>
+        <w:t>Si la proveedora decidió cómo hacerlo.</w:t>
+      </w:r>
+    </w:p>
+    <w:p>
+      <w:pPr>
+        <w:pStyle w:val="ListNumber"/>
+        <w:spacing w:before="0" w:after="60" w:line="300" w:lineRule="auto"/>
+      </w:pPr>
+      <w:r>
+        <w:rPr>
+          <w:rFonts w:ascii="Georgia" w:hAnsi="Georgia"/>
+          <w:b w:val="0"/>
+          <w:color w:val="2F2E47"/>
+          <w:sz w:val="21"/>
+        </w:rPr>
+        <w:t>Si el producto formaba parte de las tareas de su puesto.</w:t>
+      </w:r>
+    </w:p>
+    <w:p>
+      <w:pPr>
+        <w:pStyle w:val="ListNumber"/>
+        <w:spacing w:before="0" w:after="60" w:line="300" w:lineRule="auto"/>
+      </w:pPr>
+      <w:r>
+        <w:rPr>
+          <w:rFonts w:ascii="Georgia" w:hAnsi="Georgia"/>
+          <w:b w:val="0"/>
+          <w:color w:val="2F2E47"/>
+          <w:sz w:val="21"/>
+        </w:rPr>
+        <w:t>Si tenía los derechos que concedió, incluidos los de música, imágenes, código o aportes de otras personas.</w:t>
+      </w:r>
+    </w:p>
+    <w:p>
+      <w:pPr>
+        <w:spacing w:before="0" w:after="120" w:line="300" w:lineRule="auto"/>
+      </w:pPr>
+      <w:r>
+        <w:rPr>
+          <w:rFonts w:ascii="Georgia" w:hAnsi="Georgia"/>
+          <w:b w:val="0"/>
+          <w:color w:val="2F2E47"/>
+          <w:sz w:val="21"/>
+        </w:rPr>
+        <w:t>En las herramientas digitales se anota además quién concibió la herramienta, con qué recursos se desarrolló y qué información usa.</w:t>
       </w:r>
     </w:p>
     <w:p>
@@ -229,6 +334,21 @@
           <w:sz w:val="21"/>
         </w:rPr>
         <w:t>La aceptación o las observaciones, dentro de los cinco días hábiles.</w:t>
+      </w:r>
+    </w:p>
+    <w:p>
+      <w:pPr>
+        <w:pStyle w:val="ListBullet"/>
+        <w:spacing w:before="0" w:after="60" w:line="300" w:lineRule="auto"/>
+      </w:pPr>
+      <w:r>
+        <w:rPr>
+          <w:rFonts w:ascii="Georgia" w:hAnsi="Georgia"/>
+          <w:b w:val="0"/>
+          <w:color w:val="2F2E47"/>
+          <w:sz w:val="21"/>
+        </w:rPr>
+        <w:t>El pago, en el día de pago a proveedores (miércoles o jueves) siguiente a la aceptación y al comprobante.</w:t>
       </w:r>
     </w:p>
     <w:p>
@@ -463,6 +583,21 @@
           <w:sz w:val="21"/>
         </w:rPr>
         <w:t>Recurrir a declaraciones de independencia que no describan cómo se hizo el trabajo.</w:t>
+      </w:r>
+    </w:p>
+    <w:p>
+      <w:pPr>
+        <w:pStyle w:val="ListBullet"/>
+        <w:spacing w:before="0" w:after="60" w:line="300" w:lineRule="auto"/>
+      </w:pPr>
+      <w:r>
+        <w:rPr>
+          <w:rFonts w:ascii="Georgia" w:hAnsi="Georgia"/>
+          <w:b w:val="0"/>
+          <w:color w:val="2F2E47"/>
+          <w:sz w:val="21"/>
+        </w:rPr>
+        <w:t>Cambiar de canal solo para aparentar autonomía: el canal comercial se usa porque la operación es comercial.</w:t>
       </w:r>
     </w:p>
     <w:sectPr>

</xml_diff>

<commit_message>
Contratos marco v5: titularidad por categoría, exigibilidad y fecha máxima de pago, alcance de la licencia; control interno ampliado
Co-Authored-By: Claude Opus 5.5 <noreply@anthropic.com>
Claude-Session: https://claude.ai/code/session_01V7BfzBTA8TEWMK1apGBBKC
</commit_message>
<xml_diff>
--- a/casos/laboral-kcarmona/documentos/2026-10-27_Control_interno_compras_contratos_marco.docx
+++ b/casos/laboral-kcarmona/documentos/2026-10-27_Control_interno_compras_contratos_marco.docx
@@ -89,7 +89,22 @@
           <w:color w:val="2F2E47"/>
           <w:sz w:val="21"/>
         </w:rPr>
-        <w:t>Orden de compra firmada por ambas partes, con el modelo del anexo del contrato.</w:t>
+        <w:t>Orden de compra firmada por ambas partes, con el modelo del anexo 1 del contrato.</w:t>
+      </w:r>
+    </w:p>
+    <w:p>
+      <w:pPr>
+        <w:pStyle w:val="ListBullet"/>
+        <w:spacing w:before="0" w:after="60" w:line="300" w:lineRule="auto"/>
+      </w:pPr>
+      <w:r>
+        <w:rPr>
+          <w:rFonts w:ascii="Georgia" w:hAnsi="Georgia"/>
+          <w:b w:val="0"/>
+          <w:color w:val="2F2E47"/>
+          <w:sz w:val="21"/>
+        </w:rPr>
+        <w:t>Constancia de inscripción de la proveedora ante Hacienda (anexo 2), vigente y con una actividad acorde al producto.</w:t>
       </w:r>
     </w:p>
     <w:p>
@@ -271,6 +286,20 @@
           <w:color w:val="2F2E47"/>
           <w:sz w:val="21"/>
         </w:rPr>
+        <w:t>Si el producto es de la misma clase que otros pagados antes de la firma del contrato, se anota cómo se pagaban y si alguna condición laboral cambió.</w:t>
+      </w:r>
+    </w:p>
+    <w:p>
+      <w:pPr>
+        <w:spacing w:before="0" w:after="120" w:line="300" w:lineRule="auto"/>
+      </w:pPr>
+      <w:r>
+        <w:rPr>
+          <w:rFonts w:ascii="Georgia" w:hAnsi="Georgia"/>
+          <w:b w:val="0"/>
+          <w:color w:val="2F2E47"/>
+          <w:sz w:val="21"/>
+        </w:rPr>
         <w:t>En las herramientas digitales se anota además quién concibió la herramienta, con qué recursos se desarrolló y qué información usa.</w:t>
       </w:r>
     </w:p>
@@ -348,7 +377,7 @@
           <w:color w:val="2F2E47"/>
           <w:sz w:val="21"/>
         </w:rPr>
-        <w:t>El pago, en el día de pago a proveedores (miércoles o jueves) siguiente a la aceptación y al comprobante.</w:t>
+        <w:t>El pago, en el día de pago a proveedores, miércoles o jueves, a más tardar el jueves siguiente a la aceptación y al comprobante.</w:t>
       </w:r>
     </w:p>
     <w:p>

</xml_diff>

<commit_message>
Contratos marco v6: alcance delimitado, entrega accesible, comprobante según normativa, seguridad de la información, incumplimientos no subsanables
Co-Authored-By: Claude Opus 5.5 <noreply@anthropic.com>
Claude-Session: https://claude.ai/code/session_01V7BfzBTA8TEWMK1apGBBKC
</commit_message>
<xml_diff>
--- a/casos/laboral-kcarmona/documentos/2026-10-27_Control_interno_compras_contratos_marco.docx
+++ b/casos/laboral-kcarmona/documentos/2026-10-27_Control_interno_compras_contratos_marco.docx
@@ -105,6 +105,21 @@
           <w:sz w:val="21"/>
         </w:rPr>
         <w:t>Constancia de inscripción de la proveedora ante Hacienda (anexo 2), vigente y con una actividad acorde al producto.</w:t>
+      </w:r>
+    </w:p>
+    <w:p>
+      <w:pPr>
+        <w:pStyle w:val="ListBullet"/>
+        <w:spacing w:before="0" w:after="60" w:line="300" w:lineRule="auto"/>
+      </w:pPr>
+      <w:r>
+        <w:rPr>
+          <w:rFonts w:ascii="Georgia" w:hAnsi="Georgia"/>
+          <w:b w:val="0"/>
+          <w:color w:val="2F2E47"/>
+          <w:sz w:val="21"/>
+        </w:rPr>
+        <w:t>Contabilidad confirma, antes de la primera orden de cada proveedora, el tratamiento del IVA y el momento de emisión del comprobante.</w:t>
       </w:r>
     </w:p>
     <w:p>

</xml_diff>

<commit_message>
Contratos marco v7: resolución sin plazo solo ante incumplimientos graves; control interno con evidencia documental previa al pago
Co-Authored-By: Claude Opus 5.5 <noreply@anthropic.com>
Claude-Session: https://claude.ai/code/session_01V7BfzBTA8TEWMK1apGBBKC
</commit_message>
<xml_diff>
--- a/casos/laboral-kcarmona/documentos/2026-10-27_Control_interno_compras_contratos_marco.docx
+++ b/casos/laboral-kcarmona/documentos/2026-10-27_Control_interno_compras_contratos_marco.docx
@@ -213,7 +213,7 @@
           <w:color w:val="131237"/>
           <w:sz w:val="28"/>
         </w:rPr>
-        <w:t>Cuatro hechos que se anotan</w:t>
+        <w:t>Antes de autorizar el pago</w:t>
       </w:r>
     </w:p>
     <w:p>
@@ -227,7 +227,7 @@
           <w:color w:val="2F2E47"/>
           <w:sz w:val="21"/>
         </w:rPr>
-        <w:t>En cada expediente se anota, con lo que se sabe en ese momento:</w:t>
+        <w:t>La Administración verifica y anota, con documentos y no con declaraciones:</w:t>
       </w:r>
     </w:p>
     <w:p>
@@ -301,7 +301,21 @@
           <w:color w:val="2F2E47"/>
           <w:sz w:val="21"/>
         </w:rPr>
-        <w:t>Si el producto es de la misma clase que otros pagados antes de la firma del contrato, se anota cómo se pagaban y si alguna condición laboral cambió.</w:t>
+        <w:t>Cuando sea posible, se guarda evidencia de cómo se hizo el producto: archivos de trabajo y versiones previas, con sus fechas de creación y modificación; el lugar y los equipos de grabación o desarrollo; y el origen de la música, las imágenes, el código o los complementos.</w:t>
+      </w:r>
+    </w:p>
+    <w:p>
+      <w:pPr>
+        <w:spacing w:before="0" w:after="120" w:line="300" w:lineRule="auto"/>
+      </w:pPr>
+      <w:r>
+        <w:rPr>
+          <w:rFonts w:ascii="Georgia" w:hAnsi="Georgia"/>
+          <w:b w:val="0"/>
+          <w:color w:val="2F2E47"/>
+          <w:sz w:val="21"/>
+        </w:rPr>
+        <w:t>Si el producto es de la misma clase que otros pagados antes de la firma del contrato, se anota cómo se pagaban y si alguna condición laboral cambió. Una compra no reemplaza una tarea del puesto ni un pago laboral ya reconocido.</w:t>
       </w:r>
     </w:p>
     <w:p>

</xml_diff>